<commit_message>
Refresh consolidated Zapallar one-pager artifacts for campaigns 3+.
Co-authored-by: anibaloperacionesWes <anibaloperacionesWes@users.noreply.github.com>
</commit_message>
<xml_diff>
--- a/reports/Fundo_Zapallar/VALIDACION/OnePager_Validacion_Fundo_Zapallar_CONSOLIDADO.docx
+++ b/reports/Fundo_Zapallar/VALIDACION/OnePager_Validacion_Fundo_Zapallar_CONSOLIDADO.docx
@@ -187,266 +187,6 @@
                 <w:sz w:val="16"/>
               </w:rPr>
               <w:t>Estado</w:t>
-            </w:r>
-          </w:p>
-        </w:tc>
-      </w:tr>
-      <w:tr>
-        <w:tc>
-          <w:tcPr>
-            <w:tcW w:type="dxa" w:w="1331"/>
-          </w:tcPr>
-          <w:p>
-            <w:r/>
-            <w:r>
-              <w:rPr>
-                <w:rFonts w:ascii="Calibri" w:hAnsi="Calibri" w:eastAsia="Calibri"/>
-                <w:b w:val="0"/>
-                <w:sz w:val="16"/>
-              </w:rPr>
-              <w:t>22-09 (mismo día)</w:t>
-            </w:r>
-          </w:p>
-        </w:tc>
-        <w:tc>
-          <w:tcPr>
-            <w:tcW w:type="dxa" w:w="1331"/>
-          </w:tcPr>
-          <w:p>
-            <w:r/>
-            <w:r>
-              <w:rPr>
-                <w:rFonts w:ascii="Calibri" w:hAnsi="Calibri" w:eastAsia="Calibri"/>
-                <w:b w:val="0"/>
-                <w:sz w:val="16"/>
-              </w:rPr>
-              <w:t>21,74 m³</w:t>
-            </w:r>
-          </w:p>
-        </w:tc>
-        <w:tc>
-          <w:tcPr>
-            <w:tcW w:type="dxa" w:w="1331"/>
-          </w:tcPr>
-          <w:p>
-            <w:r/>
-            <w:r>
-              <w:rPr>
-                <w:rFonts w:ascii="Calibri" w:hAnsi="Calibri" w:eastAsia="Calibri"/>
-                <w:b w:val="0"/>
-                <w:sz w:val="16"/>
-              </w:rPr>
-              <w:t>22,39 m³</w:t>
-            </w:r>
-          </w:p>
-        </w:tc>
-        <w:tc>
-          <w:tcPr>
-            <w:tcW w:type="dxa" w:w="1331"/>
-          </w:tcPr>
-          <w:p>
-            <w:r/>
-            <w:r>
-              <w:rPr>
-                <w:rFonts w:ascii="Calibri" w:hAnsi="Calibri" w:eastAsia="Calibri"/>
-                <w:b w:val="0"/>
-                <w:sz w:val="16"/>
-              </w:rPr>
-              <w:t>2,9 %</w:t>
-            </w:r>
-          </w:p>
-        </w:tc>
-        <w:tc>
-          <w:tcPr>
-            <w:tcW w:type="dxa" w:w="1331"/>
-          </w:tcPr>
-          <w:p>
-            <w:r/>
-            <w:r>
-              <w:rPr>
-                <w:rFonts w:ascii="Calibri" w:hAnsi="Calibri" w:eastAsia="Calibri"/>
-                <w:b w:val="0"/>
-                <w:sz w:val="16"/>
-              </w:rPr>
-              <w:t>—</w:t>
-            </w:r>
-          </w:p>
-        </w:tc>
-        <w:tc>
-          <w:tcPr>
-            <w:tcW w:type="dxa" w:w="1331"/>
-          </w:tcPr>
-          <w:p>
-            <w:r/>
-            <w:r>
-              <w:rPr>
-                <w:rFonts w:ascii="Calibri" w:hAnsi="Calibri" w:eastAsia="Calibri"/>
-                <w:b w:val="0"/>
-                <w:sz w:val="16"/>
-              </w:rPr>
-              <w:t>—</w:t>
-            </w:r>
-          </w:p>
-        </w:tc>
-        <w:tc>
-          <w:tcPr>
-            <w:tcW w:type="dxa" w:w="1331"/>
-          </w:tcPr>
-          <w:p>
-            <w:r/>
-            <w:r>
-              <w:rPr>
-                <w:rFonts w:ascii="Calibri" w:hAnsi="Calibri" w:eastAsia="Calibri"/>
-                <w:b w:val="0"/>
-                <w:sz w:val="16"/>
-              </w:rPr>
-              <w:t>—</w:t>
-            </w:r>
-          </w:p>
-        </w:tc>
-        <w:tc>
-          <w:tcPr>
-            <w:tcW w:type="dxa" w:w="1331"/>
-          </w:tcPr>
-          <w:p>
-            <w:r/>
-            <w:r>
-              <w:rPr>
-                <w:rFonts w:ascii="Calibri" w:hAnsi="Calibri" w:eastAsia="Calibri"/>
-                <w:b w:val="0"/>
-                <w:sz w:val="16"/>
-              </w:rPr>
-              <w:t>M:Ace</w:t>
-            </w:r>
-          </w:p>
-        </w:tc>
-      </w:tr>
-      <w:tr>
-        <w:tc>
-          <w:tcPr>
-            <w:tcW w:type="dxa" w:w="1331"/>
-          </w:tcPr>
-          <w:p>
-            <w:r/>
-            <w:r>
-              <w:rPr>
-                <w:rFonts w:ascii="Calibri" w:hAnsi="Calibri" w:eastAsia="Calibri"/>
-                <w:b w:val="0"/>
-                <w:sz w:val="16"/>
-              </w:rPr>
-              <w:t>22-09 → 28-09</w:t>
-            </w:r>
-          </w:p>
-        </w:tc>
-        <w:tc>
-          <w:tcPr>
-            <w:tcW w:type="dxa" w:w="1331"/>
-          </w:tcPr>
-          <w:p>
-            <w:r/>
-            <w:r>
-              <w:rPr>
-                <w:rFonts w:ascii="Calibri" w:hAnsi="Calibri" w:eastAsia="Calibri"/>
-                <w:b w:val="0"/>
-                <w:sz w:val="16"/>
-              </w:rPr>
-              <w:t>758,5 m³</w:t>
-            </w:r>
-          </w:p>
-        </w:tc>
-        <w:tc>
-          <w:tcPr>
-            <w:tcW w:type="dxa" w:w="1331"/>
-          </w:tcPr>
-          <w:p>
-            <w:r/>
-            <w:r>
-              <w:rPr>
-                <w:rFonts w:ascii="Calibri" w:hAnsi="Calibri" w:eastAsia="Calibri"/>
-                <w:b w:val="0"/>
-                <w:sz w:val="16"/>
-              </w:rPr>
-              <w:t>785,88 m³</w:t>
-            </w:r>
-          </w:p>
-        </w:tc>
-        <w:tc>
-          <w:tcPr>
-            <w:tcW w:type="dxa" w:w="1331"/>
-          </w:tcPr>
-          <w:p>
-            <w:r/>
-            <w:r>
-              <w:rPr>
-                <w:rFonts w:ascii="Calibri" w:hAnsi="Calibri" w:eastAsia="Calibri"/>
-                <w:b w:val="0"/>
-                <w:sz w:val="16"/>
-              </w:rPr>
-              <w:t>3,5 %</w:t>
-            </w:r>
-          </w:p>
-        </w:tc>
-        <w:tc>
-          <w:tcPr>
-            <w:tcW w:type="dxa" w:w="1331"/>
-          </w:tcPr>
-          <w:p>
-            <w:r/>
-            <w:r>
-              <w:rPr>
-                <w:rFonts w:ascii="Calibri" w:hAnsi="Calibri" w:eastAsia="Calibri"/>
-                <w:b w:val="0"/>
-                <w:sz w:val="16"/>
-              </w:rPr>
-              <w:t>81,0 m³</w:t>
-            </w:r>
-          </w:p>
-        </w:tc>
-        <w:tc>
-          <w:tcPr>
-            <w:tcW w:type="dxa" w:w="1331"/>
-          </w:tcPr>
-          <w:p>
-            <w:r/>
-            <w:r>
-              <w:rPr>
-                <w:rFonts w:ascii="Calibri" w:hAnsi="Calibri" w:eastAsia="Calibri"/>
-                <w:b w:val="0"/>
-                <w:sz w:val="16"/>
-              </w:rPr>
-              <w:t>65,8 m³</w:t>
-            </w:r>
-          </w:p>
-        </w:tc>
-        <w:tc>
-          <w:tcPr>
-            <w:tcW w:type="dxa" w:w="1331"/>
-          </w:tcPr>
-          <w:p>
-            <w:r/>
-            <w:r>
-              <w:rPr>
-                <w:rFonts w:ascii="Calibri" w:hAnsi="Calibri" w:eastAsia="Calibri"/>
-                <w:b w:val="0"/>
-                <w:sz w:val="16"/>
-              </w:rPr>
-              <w:t>18,8 %</w:t>
-            </w:r>
-          </w:p>
-        </w:tc>
-        <w:tc>
-          <w:tcPr>
-            <w:tcW w:type="dxa" w:w="1331"/>
-          </w:tcPr>
-          <w:p>
-            <w:r/>
-            <w:r>
-              <w:rPr>
-                <w:rFonts w:ascii="Calibri" w:hAnsi="Calibri" w:eastAsia="Calibri"/>
-                <w:b w:val="0"/>
-                <w:sz w:val="16"/>
-              </w:rPr>
-              <w:t>M:Ace / E5:Rev</w:t>
             </w:r>
           </w:p>
         </w:tc>
@@ -865,34 +605,6 @@
           <w:b w:val="0"/>
           <w:sz w:val="16"/>
         </w:rPr>
-        <w:t>22-09 (mismo día) — 11:50 → 15:00 · ultrasónico vs Itron. Ajuste DN/mortero/M45 en terreno.</w:t>
-      </w:r>
-    </w:p>
-    <w:p>
-      <w:pPr>
-        <w:pStyle w:val="ListBullet"/>
-        <w:spacing w:after="20"/>
-      </w:pPr>
-      <w:r>
-        <w:rPr>
-          <w:rFonts w:ascii="Calibri" w:hAnsi="Calibri" w:eastAsia="Calibri"/>
-          <w:b w:val="0"/>
-          <w:sz w:val="16"/>
-        </w:rPr>
-        <w:t>22-09 → 28-09 — Validación única FINAL (cliente). Etapa 5 incluye día de intervención de placa.</w:t>
-      </w:r>
-    </w:p>
-    <w:p>
-      <w:pPr>
-        <w:pStyle w:val="ListBullet"/>
-        <w:spacing w:after="20"/>
-      </w:pPr>
-      <w:r>
-        <w:rPr>
-          <w:rFonts w:ascii="Calibri" w:hAnsi="Calibri" w:eastAsia="Calibri"/>
-          <w:b w:val="0"/>
-          <w:sz w:val="16"/>
-        </w:rPr>
         <w:t>23-09 → 02-10 — Relojería post-intervención. Cierre con fotos del 02-10.</w:t>
       </w:r>
     </w:p>
@@ -945,7 +657,7 @@
           <w:b w:val="0"/>
           <w:sz w:val="18"/>
         </w:rPr>
-        <w:t>Matriz ESVAL se mantiene estable entre 2,1 % y 3,5 % (app por encima del Itron). Etapa N°5 cierra excelente/aceptable en las campañas post-placa (0,3 % → 1,4 %); el 18,8 % del 22–28/09 corresponde a la ventana que incluye el día de intervención de memoria. Última campaña vigente: 02-10 → 15-10 (Matriz 2,5 %, Etapa 5 1,4 %).</w:t>
+        <w:t>Desde la relojería del 23-09 → 02-10, Matriz ESVAL se mantiene entre 2,1 % y 2,5 % (app por encima del Itron). Etapa N°5 cierra excelente/aceptable (0,3 % → 1,4 %). Última campaña vigente: 02-10 → 15-10 (Matriz 2,5 %, Etapa 5 1,4 %).</w:t>
       </w:r>
     </w:p>
     <w:p>
@@ -959,11 +671,10 @@
           <w:color w:val="595959"/>
           <w:sz w:val="14"/>
         </w:rPr>
-        <w:t>WES · generado 16-10-2026 15:18</w:t>
+        <w:t>WES · generado 19-10-2026 14:14</w:t>
       </w:r>
     </w:p>
     <w:sectPr>
-      <w:headerReference w:type="default" r:id="rId9"/>
       <w:pgSz w:w="12240" w:h="15840"/>
       <w:pgMar w:top="680" w:right="794" w:bottom="567" w:left="794" w:header="720" w:footer="720" w:gutter="0"/>
       <w:cols w:space="720"/>
@@ -971,52 +682,6 @@
     </w:sectPr>
   </w:body>
 </w:document>
-</file>
-
-<file path=word/header1.xml><?xml version="1.0" encoding="utf-8"?>
-<w:hdr xmlns:m="http://schemas.openxmlformats.org/officeDocument/2006/math" xmlns:mc="http://schemas.openxmlformats.org/markup-compatibility/2006" xmlns:mo="http://schemas.microsoft.com/office/mac/office/2008/main" xmlns:mv="urn:schemas-microsoft-com:mac:vml" xmlns:o="urn:schemas-microsoft-com:office:office" xmlns:r="http://schemas.openxmlformats.org/officeDocument/2006/relationships" xmlns:v="urn:schemas-microsoft-com:vml" xmlns:w10="urn:schemas-microsoft-com:office:word" xmlns:w14="http://schemas.microsoft.com/office/word/2010/wordml" xmlns:w="http://schemas.openxmlformats.org/wordprocessingml/2006/main" xmlns:wne="http://schemas.microsoft.com/office/word/2006/wordml" xmlns:wp14="http://schemas.microsoft.com/office/word/2010/wordprocessingDrawing" xmlns:wp="http://schemas.openxmlformats.org/drawingml/2006/wordprocessingDrawing" xmlns:wpc="http://schemas.microsoft.com/office/word/2010/wordprocessingCanvas" xmlns:wpg="http://schemas.microsoft.com/office/word/2010/wordprocessingGroup" xmlns:wpi="http://schemas.microsoft.com/office/word/2010/wordprocessingInk" xmlns:wps="http://schemas.microsoft.com/office/word/2010/wordprocessingShape" mc:Ignorable="w14 wp14">
-  <w:p>
-    <w:pPr>
-      <w:pStyle w:val="Header"/>
-      <w:spacing w:after="0" w:before="0"/>
-      <w:jc w:val="right"/>
-    </w:pPr>
-    <w:r>
-      <w:drawing>
-        <wp:inline xmlns:a="http://schemas.openxmlformats.org/drawingml/2006/main" xmlns:pic="http://schemas.openxmlformats.org/drawingml/2006/picture">
-          <wp:extent cx="1371600" cy="304081"/>
-          <wp:docPr id="1" name="Picture 1"/>
-          <wp:cNvGraphicFramePr>
-            <a:graphicFrameLocks noChangeAspect="1"/>
-          </wp:cNvGraphicFramePr>
-          <a:graphic>
-            <a:graphicData uri="http://schemas.openxmlformats.org/drawingml/2006/picture">
-              <pic:pic>
-                <pic:nvPicPr>
-                  <pic:cNvPr id="0" name="logo wes.bmp"/>
-                  <pic:cNvPicPr/>
-                </pic:nvPicPr>
-                <pic:blipFill>
-                  <a:blip r:embed="rId1"/>
-                  <a:stretch>
-                    <a:fillRect/>
-                  </a:stretch>
-                </pic:blipFill>
-                <pic:spPr>
-                  <a:xfrm>
-                    <a:off x="0" y="0"/>
-                    <a:ext cx="1371600" cy="304081"/>
-                  </a:xfrm>
-                  <a:prstGeom prst="rect"/>
-                </pic:spPr>
-              </pic:pic>
-            </a:graphicData>
-          </a:graphic>
-        </wp:inline>
-      </w:drawing>
-    </w:r>
-  </w:p>
-</w:hdr>
 </file>
 
 <file path=word/numbering.xml><?xml version="1.0" encoding="utf-8"?>

</xml_diff>